<commit_message>
Underline glossary terms in the numbered fragment
Co-Authored-By: Claude Opus 5.5 <noreply@anthropic.com>
Claude-Session: https://claude.ai/code/session_013Xxu2m9CWM8tKPgDAjjPtT
</commit_message>
<xml_diff>
--- a/isppr-translation/Landwehr_2022_fragment_numbered.docx
+++ b/isppr-translation/Landwehr_2022_fragment_numbered.docx
@@ -59,7 +59,7 @@
           <w:sz w:val="22"/>
           <w:szCs w:val="22"/>
         </w:rPr>
-        <w:t xml:space="preserve">Фрагмент для перевода: разделы 2.4–4 (до подраздела 4.1), с. 711–713. Надстрочные номера после терминов указывают номер термина в терминологическом словаре.</w:t>
+        <w:t xml:space="preserve">Фрагмент для перевода: разделы 2.4–4 (до подраздела 4.1), с. 711–713. Термины из глоссария подчёркнуты; надстрочная цифра после термина — его номер в глоссарии.</w:t>
       </w:r>
     </w:p>
     <w:p>
@@ -88,6 +88,7 @@
           <w:iCs w:val="false"/>
           <w:sz w:val="28"/>
           <w:szCs w:val="28"/>
+          <w:u w:val="single"/>
         </w:rPr>
         <w:t xml:space="preserve">Image-Based Decision Support Systems</w:t>
       </w:r>
@@ -131,6 +132,7 @@
           <w:iCs w:val="false"/>
           <w:sz w:val="28"/>
           <w:szCs w:val="28"/>
+          <w:u w:val="single"/>
         </w:rPr>
         <w:t xml:space="preserve">DL</w:t>
       </w:r>
@@ -167,6 +169,7 @@
           <w:iCs w:val="false"/>
           <w:sz w:val="28"/>
           <w:szCs w:val="28"/>
+          <w:u w:val="single"/>
         </w:rPr>
         <w:t xml:space="preserve">DL</w:t>
       </w:r>
@@ -203,6 +206,7 @@
           <w:iCs w:val="false"/>
           <w:sz w:val="28"/>
           <w:szCs w:val="28"/>
+          <w:u w:val="single"/>
         </w:rPr>
         <w:t xml:space="preserve">DL</w:t>
       </w:r>
@@ -239,6 +243,7 @@
           <w:iCs w:val="false"/>
           <w:sz w:val="28"/>
           <w:szCs w:val="28"/>
+          <w:u w:val="single"/>
         </w:rPr>
         <w:t xml:space="preserve">CNNs</w:t>
       </w:r>
@@ -275,6 +280,7 @@
           <w:iCs w:val="false"/>
           <w:sz w:val="28"/>
           <w:szCs w:val="28"/>
+          <w:u w:val="single"/>
         </w:rPr>
         <w:t xml:space="preserve">IS</w:t>
       </w:r>
@@ -311,6 +317,7 @@
           <w:iCs w:val="false"/>
           <w:sz w:val="28"/>
           <w:szCs w:val="28"/>
+          <w:u w:val="single"/>
         </w:rPr>
         <w:t xml:space="preserve">DSS</w:t>
       </w:r>
@@ -347,6 +354,7 @@
           <w:iCs w:val="false"/>
           <w:sz w:val="28"/>
           <w:szCs w:val="28"/>
+          <w:u w:val="single"/>
         </w:rPr>
         <w:t xml:space="preserve">application domain</w:t>
       </w:r>
@@ -383,6 +391,7 @@
           <w:iCs w:val="false"/>
           <w:sz w:val="28"/>
           <w:szCs w:val="28"/>
+          <w:u w:val="single"/>
         </w:rPr>
         <w:t xml:space="preserve">DL</w:t>
       </w:r>
@@ -419,6 +428,7 @@
           <w:iCs w:val="false"/>
           <w:sz w:val="28"/>
           <w:szCs w:val="28"/>
+          <w:u w:val="single"/>
         </w:rPr>
         <w:t xml:space="preserve">vision-based</w:t>
       </w:r>
@@ -455,6 +465,7 @@
           <w:iCs w:val="false"/>
           <w:sz w:val="28"/>
           <w:szCs w:val="28"/>
+          <w:u w:val="single"/>
         </w:rPr>
         <w:t xml:space="preserve">pattern analysis</w:t>
       </w:r>
@@ -510,6 +521,7 @@
           <w:iCs w:val="false"/>
           <w:sz w:val="28"/>
           <w:szCs w:val="28"/>
+          <w:u w:val="single"/>
         </w:rPr>
         <w:t xml:space="preserve">DL</w:t>
       </w:r>
@@ -546,6 +558,7 @@
           <w:iCs w:val="false"/>
           <w:sz w:val="28"/>
           <w:szCs w:val="28"/>
+          <w:u w:val="single"/>
         </w:rPr>
         <w:t xml:space="preserve">IB-DSS</w:t>
       </w:r>
@@ -619,6 +632,7 @@
           <w:iCs w:val="false"/>
           <w:sz w:val="28"/>
           <w:szCs w:val="28"/>
+          <w:u w:val="single"/>
         </w:rPr>
         <w:t xml:space="preserve">power line maintenance</w:t>
       </w:r>
@@ -644,17 +658,43 @@
           <w:sz w:val="28"/>
           <w:szCs w:val="28"/>
         </w:rPr>
-        <w:t xml:space="preserve"> (PLM) with the need for decision support in </w:t>
-      </w:r>
-      <w:r>
-        <w:rPr>
-          <w:rFonts w:ascii="Times New Roman" w:cs="Times New Roman" w:eastAsia="Times New Roman" w:hAnsi="Times New Roman"/>
-          <w:b w:val="false"/>
-          <w:bCs w:val="false"/>
-          <w:i w:val="false"/>
-          <w:iCs w:val="false"/>
-          <w:sz w:val="28"/>
-          <w:szCs w:val="28"/>
+        <w:t xml:space="preserve"> (</w:t>
+      </w:r>
+      <w:r>
+        <w:rPr>
+          <w:rFonts w:ascii="Times New Roman" w:cs="Times New Roman" w:eastAsia="Times New Roman" w:hAnsi="Times New Roman"/>
+          <w:b w:val="false"/>
+          <w:bCs w:val="false"/>
+          <w:i w:val="false"/>
+          <w:iCs w:val="false"/>
+          <w:sz w:val="28"/>
+          <w:szCs w:val="28"/>
+          <w:u w:val="single"/>
+        </w:rPr>
+        <w:t xml:space="preserve">PLM</w:t>
+      </w:r>
+      <w:r>
+        <w:rPr>
+          <w:rFonts w:ascii="Times New Roman" w:cs="Times New Roman" w:eastAsia="Times New Roman" w:hAnsi="Times New Roman"/>
+          <w:b w:val="false"/>
+          <w:bCs w:val="false"/>
+          <w:i w:val="false"/>
+          <w:iCs w:val="false"/>
+          <w:sz w:val="28"/>
+          <w:szCs w:val="28"/>
+        </w:rPr>
+        <w:t xml:space="preserve">) with the need for decision support in </w:t>
+      </w:r>
+      <w:r>
+        <w:rPr>
+          <w:rFonts w:ascii="Times New Roman" w:cs="Times New Roman" w:eastAsia="Times New Roman" w:hAnsi="Times New Roman"/>
+          <w:b w:val="false"/>
+          <w:bCs w:val="false"/>
+          <w:i w:val="false"/>
+          <w:iCs w:val="false"/>
+          <w:sz w:val="28"/>
+          <w:szCs w:val="28"/>
+          <w:u w:val="single"/>
         </w:rPr>
         <w:t xml:space="preserve">vision-based</w:t>
       </w:r>
@@ -691,6 +731,7 @@
           <w:iCs w:val="false"/>
           <w:sz w:val="28"/>
           <w:szCs w:val="28"/>
+          <w:u w:val="single"/>
         </w:rPr>
         <w:t xml:space="preserve">PLM</w:t>
       </w:r>
@@ -746,6 +787,7 @@
           <w:iCs w:val="false"/>
           <w:sz w:val="28"/>
           <w:szCs w:val="28"/>
+          <w:u w:val="single"/>
         </w:rPr>
         <w:t xml:space="preserve">vision-based</w:t>
       </w:r>
@@ -782,6 +824,7 @@
           <w:iCs w:val="false"/>
           <w:sz w:val="28"/>
           <w:szCs w:val="28"/>
+          <w:u w:val="single"/>
         </w:rPr>
         <w:t xml:space="preserve">PLC</w:t>
       </w:r>
@@ -818,6 +861,7 @@
           <w:iCs w:val="false"/>
           <w:sz w:val="28"/>
           <w:szCs w:val="28"/>
+          <w:u w:val="single"/>
         </w:rPr>
         <w:t xml:space="preserve">IB-DSS</w:t>
       </w:r>
@@ -854,6 +898,7 @@
           <w:iCs w:val="false"/>
           <w:sz w:val="28"/>
           <w:szCs w:val="28"/>
+          <w:u w:val="single"/>
         </w:rPr>
         <w:t xml:space="preserve">PLC</w:t>
       </w:r>
@@ -890,6 +935,7 @@
           <w:iCs w:val="false"/>
           <w:sz w:val="28"/>
           <w:szCs w:val="28"/>
+          <w:u w:val="single"/>
         </w:rPr>
         <w:t xml:space="preserve">detect</w:t>
       </w:r>
@@ -926,6 +972,7 @@
           <w:iCs w:val="false"/>
           <w:sz w:val="28"/>
           <w:szCs w:val="28"/>
+          <w:u w:val="single"/>
         </w:rPr>
         <w:t xml:space="preserve">PLCs</w:t>
       </w:r>
@@ -962,6 +1009,7 @@
           <w:iCs w:val="false"/>
           <w:sz w:val="28"/>
           <w:szCs w:val="28"/>
+          <w:u w:val="single"/>
         </w:rPr>
         <w:t xml:space="preserve">insulators</w:t>
       </w:r>
@@ -998,6 +1046,7 @@
           <w:iCs w:val="false"/>
           <w:sz w:val="28"/>
           <w:szCs w:val="28"/>
+          <w:u w:val="single"/>
         </w:rPr>
         <w:t xml:space="preserve">safety pins</w:t>
       </w:r>
@@ -1071,6 +1120,7 @@
           <w:iCs w:val="false"/>
           <w:sz w:val="28"/>
           <w:szCs w:val="28"/>
+          <w:u w:val="single"/>
         </w:rPr>
         <w:t xml:space="preserve">IB-DSS</w:t>
       </w:r>
@@ -1107,6 +1157,7 @@
           <w:iCs w:val="false"/>
           <w:sz w:val="28"/>
           <w:szCs w:val="28"/>
+          <w:u w:val="single"/>
         </w:rPr>
         <w:t xml:space="preserve">maintenance engineers</w:t>
       </w:r>
@@ -1132,17 +1183,43 @@
           <w:sz w:val="28"/>
           <w:szCs w:val="28"/>
         </w:rPr>
-        <w:t xml:space="preserve"> (MEs) for </w:t>
-      </w:r>
-      <w:r>
-        <w:rPr>
-          <w:rFonts w:ascii="Times New Roman" w:cs="Times New Roman" w:eastAsia="Times New Roman" w:hAnsi="Times New Roman"/>
-          <w:b w:val="false"/>
-          <w:bCs w:val="false"/>
-          <w:i w:val="false"/>
-          <w:iCs w:val="false"/>
-          <w:sz w:val="28"/>
-          <w:szCs w:val="28"/>
+        <w:t xml:space="preserve"> (</w:t>
+      </w:r>
+      <w:r>
+        <w:rPr>
+          <w:rFonts w:ascii="Times New Roman" w:cs="Times New Roman" w:eastAsia="Times New Roman" w:hAnsi="Times New Roman"/>
+          <w:b w:val="false"/>
+          <w:bCs w:val="false"/>
+          <w:i w:val="false"/>
+          <w:iCs w:val="false"/>
+          <w:sz w:val="28"/>
+          <w:szCs w:val="28"/>
+          <w:u w:val="single"/>
+        </w:rPr>
+        <w:t xml:space="preserve">MEs</w:t>
+      </w:r>
+      <w:r>
+        <w:rPr>
+          <w:rFonts w:ascii="Times New Roman" w:cs="Times New Roman" w:eastAsia="Times New Roman" w:hAnsi="Times New Roman"/>
+          <w:b w:val="false"/>
+          <w:bCs w:val="false"/>
+          <w:i w:val="false"/>
+          <w:iCs w:val="false"/>
+          <w:sz w:val="28"/>
+          <w:szCs w:val="28"/>
+        </w:rPr>
+        <w:t xml:space="preserve">) for </w:t>
+      </w:r>
+      <w:r>
+        <w:rPr>
+          <w:rFonts w:ascii="Times New Roman" w:cs="Times New Roman" w:eastAsia="Times New Roman" w:hAnsi="Times New Roman"/>
+          <w:b w:val="false"/>
+          <w:bCs w:val="false"/>
+          <w:i w:val="false"/>
+          <w:iCs w:val="false"/>
+          <w:sz w:val="28"/>
+          <w:szCs w:val="28"/>
+          <w:u w:val="single"/>
         </w:rPr>
         <w:t xml:space="preserve">power lines</w:t>
       </w:r>
@@ -1179,6 +1256,7 @@
           <w:iCs w:val="false"/>
           <w:sz w:val="28"/>
           <w:szCs w:val="28"/>
+          <w:u w:val="single"/>
         </w:rPr>
         <w:t xml:space="preserve">design science research</w:t>
       </w:r>
@@ -1204,17 +1282,43 @@
           <w:sz w:val="28"/>
           <w:szCs w:val="28"/>
         </w:rPr>
-        <w:t xml:space="preserve"> (DSR) has proven itself to be not only a suitable but also an important paradigm to develop </w:t>
-      </w:r>
-      <w:r>
-        <w:rPr>
-          <w:rFonts w:ascii="Times New Roman" w:cs="Times New Roman" w:eastAsia="Times New Roman" w:hAnsi="Times New Roman"/>
-          <w:b w:val="false"/>
-          <w:bCs w:val="false"/>
-          <w:i w:val="false"/>
-          <w:iCs w:val="false"/>
-          <w:sz w:val="28"/>
-          <w:szCs w:val="28"/>
+        <w:t xml:space="preserve"> (</w:t>
+      </w:r>
+      <w:r>
+        <w:rPr>
+          <w:rFonts w:ascii="Times New Roman" w:cs="Times New Roman" w:eastAsia="Times New Roman" w:hAnsi="Times New Roman"/>
+          <w:b w:val="false"/>
+          <w:bCs w:val="false"/>
+          <w:i w:val="false"/>
+          <w:iCs w:val="false"/>
+          <w:sz w:val="28"/>
+          <w:szCs w:val="28"/>
+          <w:u w:val="single"/>
+        </w:rPr>
+        <w:t xml:space="preserve">DSR</w:t>
+      </w:r>
+      <w:r>
+        <w:rPr>
+          <w:rFonts w:ascii="Times New Roman" w:cs="Times New Roman" w:eastAsia="Times New Roman" w:hAnsi="Times New Roman"/>
+          <w:b w:val="false"/>
+          <w:bCs w:val="false"/>
+          <w:i w:val="false"/>
+          <w:iCs w:val="false"/>
+          <w:sz w:val="28"/>
+          <w:szCs w:val="28"/>
+        </w:rPr>
+        <w:t xml:space="preserve">) has proven itself to be not only a suitable but also an important paradigm to develop </w:t>
+      </w:r>
+      <w:r>
+        <w:rPr>
+          <w:rFonts w:ascii="Times New Roman" w:cs="Times New Roman" w:eastAsia="Times New Roman" w:hAnsi="Times New Roman"/>
+          <w:b w:val="false"/>
+          <w:bCs w:val="false"/>
+          <w:i w:val="false"/>
+          <w:iCs w:val="false"/>
+          <w:sz w:val="28"/>
+          <w:szCs w:val="28"/>
+          <w:u w:val="single"/>
         </w:rPr>
         <w:t xml:space="preserve">IS</w:t>
       </w:r>
@@ -1251,6 +1355,7 @@
           <w:iCs w:val="false"/>
           <w:sz w:val="28"/>
           <w:szCs w:val="28"/>
+          <w:u w:val="single"/>
         </w:rPr>
         <w:t xml:space="preserve">DSS</w:t>
       </w:r>
@@ -1287,6 +1392,7 @@
           <w:iCs w:val="false"/>
           <w:sz w:val="28"/>
           <w:szCs w:val="28"/>
+          <w:u w:val="single"/>
         </w:rPr>
         <w:t xml:space="preserve">DSR</w:t>
       </w:r>
@@ -1323,6 +1429,7 @@
           <w:iCs w:val="false"/>
           <w:sz w:val="28"/>
           <w:szCs w:val="28"/>
+          <w:u w:val="single"/>
         </w:rPr>
         <w:t xml:space="preserve">knowledge base</w:t>
       </w:r>
@@ -1359,6 +1466,7 @@
           <w:iCs w:val="false"/>
           <w:sz w:val="28"/>
           <w:szCs w:val="28"/>
+          <w:u w:val="single"/>
         </w:rPr>
         <w:t xml:space="preserve">IB-DSS</w:t>
       </w:r>
@@ -1414,6 +1522,7 @@
           <w:iCs w:val="false"/>
           <w:sz w:val="28"/>
           <w:szCs w:val="28"/>
+          <w:u w:val="single"/>
         </w:rPr>
         <w:t xml:space="preserve">DSR</w:t>
       </w:r>
@@ -1450,6 +1559,7 @@
           <w:iCs w:val="false"/>
           <w:sz w:val="28"/>
           <w:szCs w:val="28"/>
+          <w:u w:val="single"/>
         </w:rPr>
         <w:t xml:space="preserve">application domain</w:t>
       </w:r>
@@ -1486,6 +1596,7 @@
           <w:iCs w:val="false"/>
           <w:sz w:val="28"/>
           <w:szCs w:val="28"/>
+          <w:u w:val="single"/>
         </w:rPr>
         <w:t xml:space="preserve">design science</w:t>
       </w:r>
@@ -1522,6 +1633,7 @@
           <w:iCs w:val="false"/>
           <w:sz w:val="28"/>
           <w:szCs w:val="28"/>
+          <w:u w:val="single"/>
         </w:rPr>
         <w:t xml:space="preserve">acceptance criteria</w:t>
       </w:r>
@@ -1558,6 +1670,7 @@
           <w:iCs w:val="false"/>
           <w:sz w:val="28"/>
           <w:szCs w:val="28"/>
+          <w:u w:val="single"/>
         </w:rPr>
         <w:t xml:space="preserve">design science</w:t>
       </w:r>
@@ -1594,6 +1707,7 @@
           <w:iCs w:val="false"/>
           <w:sz w:val="28"/>
           <w:szCs w:val="28"/>
+          <w:u w:val="single"/>
         </w:rPr>
         <w:t xml:space="preserve">knowledge base</w:t>
       </w:r>
@@ -1630,6 +1744,7 @@
           <w:iCs w:val="false"/>
           <w:sz w:val="28"/>
           <w:szCs w:val="28"/>
+          <w:u w:val="single"/>
         </w:rPr>
         <w:t xml:space="preserve">DSR</w:t>
       </w:r>
@@ -1666,6 +1781,7 @@
           <w:iCs w:val="false"/>
           <w:sz w:val="28"/>
           <w:szCs w:val="28"/>
+          <w:u w:val="single"/>
         </w:rPr>
         <w:t xml:space="preserve">deploy</w:t>
       </w:r>
@@ -1702,6 +1818,7 @@
           <w:iCs w:val="false"/>
           <w:sz w:val="28"/>
           <w:szCs w:val="28"/>
+          <w:u w:val="single"/>
         </w:rPr>
         <w:t xml:space="preserve">knowledge base</w:t>
       </w:r>
@@ -1757,6 +1874,7 @@
           <w:iCs w:val="false"/>
           <w:sz w:val="28"/>
           <w:szCs w:val="28"/>
+          <w:u w:val="single"/>
         </w:rPr>
         <w:t xml:space="preserve">IB-DSS</w:t>
       </w:r>
@@ -1793,6 +1911,7 @@
           <w:iCs w:val="false"/>
           <w:sz w:val="28"/>
           <w:szCs w:val="28"/>
+          <w:u w:val="single"/>
         </w:rPr>
         <w:t xml:space="preserve">PLM</w:t>
       </w:r>
@@ -1829,6 +1948,7 @@
           <w:iCs w:val="false"/>
           <w:sz w:val="28"/>
           <w:szCs w:val="28"/>
+          <w:u w:val="single"/>
         </w:rPr>
         <w:t xml:space="preserve">DSS</w:t>
       </w:r>
@@ -1865,6 +1985,7 @@
           <w:iCs/>
           <w:sz w:val="28"/>
           <w:szCs w:val="28"/>
+          <w:u w:val="single"/>
         </w:rPr>
         <w:t xml:space="preserve">model component</w:t>
       </w:r>
@@ -1890,17 +2011,43 @@
           <w:sz w:val="28"/>
           <w:szCs w:val="28"/>
         </w:rPr>
-        <w:t xml:space="preserve"> (MC) of our </w:t>
-      </w:r>
-      <w:r>
-        <w:rPr>
-          <w:rFonts w:ascii="Times New Roman" w:cs="Times New Roman" w:eastAsia="Times New Roman" w:hAnsi="Times New Roman"/>
-          <w:b w:val="false"/>
-          <w:bCs w:val="false"/>
-          <w:i w:val="false"/>
-          <w:iCs w:val="false"/>
-          <w:sz w:val="28"/>
-          <w:szCs w:val="28"/>
+        <w:t xml:space="preserve"> (</w:t>
+      </w:r>
+      <w:r>
+        <w:rPr>
+          <w:rFonts w:ascii="Times New Roman" w:cs="Times New Roman" w:eastAsia="Times New Roman" w:hAnsi="Times New Roman"/>
+          <w:b w:val="false"/>
+          <w:bCs w:val="false"/>
+          <w:i w:val="false"/>
+          <w:iCs w:val="false"/>
+          <w:sz w:val="28"/>
+          <w:szCs w:val="28"/>
+          <w:u w:val="single"/>
+        </w:rPr>
+        <w:t xml:space="preserve">MC</w:t>
+      </w:r>
+      <w:r>
+        <w:rPr>
+          <w:rFonts w:ascii="Times New Roman" w:cs="Times New Roman" w:eastAsia="Times New Roman" w:hAnsi="Times New Roman"/>
+          <w:b w:val="false"/>
+          <w:bCs w:val="false"/>
+          <w:i w:val="false"/>
+          <w:iCs w:val="false"/>
+          <w:sz w:val="28"/>
+          <w:szCs w:val="28"/>
+        </w:rPr>
+        <w:t xml:space="preserve">) of our </w:t>
+      </w:r>
+      <w:r>
+        <w:rPr>
+          <w:rFonts w:ascii="Times New Roman" w:cs="Times New Roman" w:eastAsia="Times New Roman" w:hAnsi="Times New Roman"/>
+          <w:b w:val="false"/>
+          <w:bCs w:val="false"/>
+          <w:i w:val="false"/>
+          <w:iCs w:val="false"/>
+          <w:sz w:val="28"/>
+          <w:szCs w:val="28"/>
+          <w:u w:val="single"/>
         </w:rPr>
         <w:t xml:space="preserve">DSS</w:t>
       </w:r>
@@ -1937,6 +2084,7 @@
           <w:iCs/>
           <w:sz w:val="28"/>
           <w:szCs w:val="28"/>
+          <w:u w:val="single"/>
         </w:rPr>
         <w:t xml:space="preserve">user interface component</w:t>
       </w:r>
@@ -1962,17 +2110,43 @@
           <w:sz w:val="28"/>
           <w:szCs w:val="28"/>
         </w:rPr>
-        <w:t xml:space="preserve"> (UIC) in the second design cycle (Sect. 5.3). To orchestrate the evaluation of our artifact, we apply and follow the overarching Framework for evaluation in design science (Venable et al. 2016) to rigorously demonstrate the utility and efficiency of the artifact and its underlying design knowledge. Figure 1 provides an overview of the performed evaluation episodes (EE) in these design cycles. As it is our goal to indicate technical feasibility as well as utility of </w:t>
-      </w:r>
-      <w:r>
-        <w:rPr>
-          <w:rFonts w:ascii="Times New Roman" w:cs="Times New Roman" w:eastAsia="Times New Roman" w:hAnsi="Times New Roman"/>
-          <w:b w:val="false"/>
-          <w:bCs w:val="false"/>
-          <w:i w:val="false"/>
-          <w:iCs w:val="false"/>
-          <w:sz w:val="28"/>
-          <w:szCs w:val="28"/>
+        <w:t xml:space="preserve"> (</w:t>
+      </w:r>
+      <w:r>
+        <w:rPr>
+          <w:rFonts w:ascii="Times New Roman" w:cs="Times New Roman" w:eastAsia="Times New Roman" w:hAnsi="Times New Roman"/>
+          <w:b w:val="false"/>
+          <w:bCs w:val="false"/>
+          <w:i w:val="false"/>
+          <w:iCs w:val="false"/>
+          <w:sz w:val="28"/>
+          <w:szCs w:val="28"/>
+          <w:u w:val="single"/>
+        </w:rPr>
+        <w:t xml:space="preserve">UIC</w:t>
+      </w:r>
+      <w:r>
+        <w:rPr>
+          <w:rFonts w:ascii="Times New Roman" w:cs="Times New Roman" w:eastAsia="Times New Roman" w:hAnsi="Times New Roman"/>
+          <w:b w:val="false"/>
+          <w:bCs w:val="false"/>
+          <w:i w:val="false"/>
+          <w:iCs w:val="false"/>
+          <w:sz w:val="28"/>
+          <w:szCs w:val="28"/>
+        </w:rPr>
+        <w:t xml:space="preserve">) in the second design cycle (Sect. 5.3). To orchestrate the evaluation of our artifact, we apply and follow the overarching Framework for evaluation in design science (Venable et al. 2016) to rigorously demonstrate the utility and efficiency of the artifact and its underlying design knowledge. Figure 1 provides an overview of the performed evaluation episodes (EE) in these design cycles. As it is our goal to indicate technical feasibility as well as utility of </w:t>
+      </w:r>
+      <w:r>
+        <w:rPr>
+          <w:rFonts w:ascii="Times New Roman" w:cs="Times New Roman" w:eastAsia="Times New Roman" w:hAnsi="Times New Roman"/>
+          <w:b w:val="false"/>
+          <w:bCs w:val="false"/>
+          <w:i w:val="false"/>
+          <w:iCs w:val="false"/>
+          <w:sz w:val="28"/>
+          <w:szCs w:val="28"/>
+          <w:u w:val="single"/>
         </w:rPr>
         <w:t xml:space="preserve">IB-DSS</w:t>
       </w:r>
@@ -2009,6 +2183,7 @@
           <w:iCs w:val="false"/>
           <w:sz w:val="28"/>
           <w:szCs w:val="28"/>
+          <w:u w:val="single"/>
         </w:rPr>
         <w:t xml:space="preserve">DL</w:t>
       </w:r>
@@ -2082,6 +2257,7 @@
           <w:iCs w:val="false"/>
           <w:sz w:val="28"/>
           <w:szCs w:val="28"/>
+          <w:u w:val="single"/>
         </w:rPr>
         <w:t xml:space="preserve">DSS</w:t>
       </w:r>
@@ -2118,6 +2294,7 @@
           <w:iCs w:val="false"/>
           <w:sz w:val="28"/>
           <w:szCs w:val="28"/>
+          <w:u w:val="single"/>
         </w:rPr>
         <w:t xml:space="preserve">MEs</w:t>
       </w:r>
@@ -2154,6 +2331,7 @@
           <w:iCs w:val="false"/>
           <w:sz w:val="28"/>
           <w:szCs w:val="28"/>
+          <w:u w:val="single"/>
         </w:rPr>
         <w:t xml:space="preserve">power line</w:t>
       </w:r>
@@ -2190,6 +2368,7 @@
           <w:iCs w:val="false"/>
           <w:sz w:val="28"/>
           <w:szCs w:val="28"/>
+          <w:u w:val="single"/>
         </w:rPr>
         <w:t xml:space="preserve">maintenance orders</w:t>
       </w:r>
@@ -2226,6 +2405,7 @@
           <w:iCs w:val="false"/>
           <w:sz w:val="28"/>
           <w:szCs w:val="28"/>
+          <w:u w:val="single"/>
         </w:rPr>
         <w:t xml:space="preserve">socio-technical</w:t>
       </w:r>
@@ -2262,6 +2442,7 @@
           <w:iCs w:val="false"/>
           <w:sz w:val="28"/>
           <w:szCs w:val="28"/>
+          <w:u w:val="single"/>
         </w:rPr>
         <w:t xml:space="preserve">design principles</w:t>
       </w:r>
@@ -2287,23 +2468,49 @@
           <w:sz w:val="28"/>
           <w:szCs w:val="28"/>
         </w:rPr>
-        <w:t xml:space="preserve"> (DPs). We therefore conceptualize and suggest a number of tentative </w:t>
-      </w:r>
-      <w:r>
-        <w:rPr>
-          <w:rFonts w:ascii="Times New Roman" w:cs="Times New Roman" w:eastAsia="Times New Roman" w:hAnsi="Times New Roman"/>
-          <w:b w:val="false"/>
-          <w:bCs w:val="false"/>
-          <w:i w:val="false"/>
-          <w:iCs w:val="false"/>
-          <w:sz w:val="28"/>
-          <w:szCs w:val="28"/>
+        <w:t xml:space="preserve"> (</w:t>
+      </w:r>
+      <w:r>
+        <w:rPr>
+          <w:rFonts w:ascii="Times New Roman" w:cs="Times New Roman" w:eastAsia="Times New Roman" w:hAnsi="Times New Roman"/>
+          <w:b w:val="false"/>
+          <w:bCs w:val="false"/>
+          <w:i w:val="false"/>
+          <w:iCs w:val="false"/>
+          <w:sz w:val="28"/>
+          <w:szCs w:val="28"/>
+          <w:u w:val="single"/>
         </w:rPr>
         <w:t xml:space="preserve">DPs</w:t>
       </w:r>
       <w:r>
         <w:rPr>
           <w:rFonts w:ascii="Times New Roman" w:cs="Times New Roman" w:eastAsia="Times New Roman" w:hAnsi="Times New Roman"/>
+          <w:b w:val="false"/>
+          <w:bCs w:val="false"/>
+          <w:i w:val="false"/>
+          <w:iCs w:val="false"/>
+          <w:sz w:val="28"/>
+          <w:szCs w:val="28"/>
+        </w:rPr>
+        <w:t xml:space="preserve">). We therefore conceptualize and suggest a number of tentative </w:t>
+      </w:r>
+      <w:r>
+        <w:rPr>
+          <w:rFonts w:ascii="Times New Roman" w:cs="Times New Roman" w:eastAsia="Times New Roman" w:hAnsi="Times New Roman"/>
+          <w:b w:val="false"/>
+          <w:bCs w:val="false"/>
+          <w:i w:val="false"/>
+          <w:iCs w:val="false"/>
+          <w:sz w:val="28"/>
+          <w:szCs w:val="28"/>
+          <w:u w:val="single"/>
+        </w:rPr>
+        <w:t xml:space="preserve">DPs</w:t>
+      </w:r>
+      <w:r>
+        <w:rPr>
+          <w:rFonts w:ascii="Times New Roman" w:cs="Times New Roman" w:eastAsia="Times New Roman" w:hAnsi="Times New Roman"/>
           <w:b/>
           <w:bCs/>
           <w:color w:val="1F4E79"/>
@@ -2334,6 +2541,7 @@
           <w:iCs w:val="false"/>
           <w:sz w:val="28"/>
           <w:szCs w:val="28"/>
+          <w:u w:val="single"/>
         </w:rPr>
         <w:t xml:space="preserve">IB-DSS</w:t>
       </w:r>
@@ -2370,6 +2578,7 @@
           <w:iCs w:val="false"/>
           <w:sz w:val="28"/>
           <w:szCs w:val="28"/>
+          <w:u w:val="single"/>
         </w:rPr>
         <w:t xml:space="preserve">power line maintenance</w:t>
       </w:r>
@@ -2395,17 +2604,43 @@
           <w:sz w:val="28"/>
           <w:szCs w:val="28"/>
         </w:rPr>
-        <w:t xml:space="preserve"> (PLM). These are recast into a prescriptive mode with appropriate abstraction yielding preliminary </w:t>
-      </w:r>
-      <w:r>
-        <w:rPr>
-          <w:rFonts w:ascii="Times New Roman" w:cs="Times New Roman" w:eastAsia="Times New Roman" w:hAnsi="Times New Roman"/>
-          <w:b w:val="false"/>
-          <w:bCs w:val="false"/>
-          <w:i w:val="false"/>
-          <w:iCs w:val="false"/>
-          <w:sz w:val="28"/>
-          <w:szCs w:val="28"/>
+        <w:t xml:space="preserve"> (</w:t>
+      </w:r>
+      <w:r>
+        <w:rPr>
+          <w:rFonts w:ascii="Times New Roman" w:cs="Times New Roman" w:eastAsia="Times New Roman" w:hAnsi="Times New Roman"/>
+          <w:b w:val="false"/>
+          <w:bCs w:val="false"/>
+          <w:i w:val="false"/>
+          <w:iCs w:val="false"/>
+          <w:sz w:val="28"/>
+          <w:szCs w:val="28"/>
+          <w:u w:val="single"/>
+        </w:rPr>
+        <w:t xml:space="preserve">PLM</w:t>
+      </w:r>
+      <w:r>
+        <w:rPr>
+          <w:rFonts w:ascii="Times New Roman" w:cs="Times New Roman" w:eastAsia="Times New Roman" w:hAnsi="Times New Roman"/>
+          <w:b w:val="false"/>
+          <w:bCs w:val="false"/>
+          <w:i w:val="false"/>
+          <w:iCs w:val="false"/>
+          <w:sz w:val="28"/>
+          <w:szCs w:val="28"/>
+        </w:rPr>
+        <w:t xml:space="preserve">). These are recast into a prescriptive mode with appropriate abstraction yielding preliminary </w:t>
+      </w:r>
+      <w:r>
+        <w:rPr>
+          <w:rFonts w:ascii="Times New Roman" w:cs="Times New Roman" w:eastAsia="Times New Roman" w:hAnsi="Times New Roman"/>
+          <w:b w:val="false"/>
+          <w:bCs w:val="false"/>
+          <w:i w:val="false"/>
+          <w:iCs w:val="false"/>
+          <w:sz w:val="28"/>
+          <w:szCs w:val="28"/>
+          <w:u w:val="single"/>
         </w:rPr>
         <w:t xml:space="preserve">design requirements</w:t>
       </w:r>
@@ -2431,17 +2666,43 @@
           <w:sz w:val="28"/>
           <w:szCs w:val="28"/>
         </w:rPr>
-        <w:t xml:space="preserve"> (DRs), which then serve as a basis for deriving the </w:t>
-      </w:r>
-      <w:r>
-        <w:rPr>
-          <w:rFonts w:ascii="Times New Roman" w:cs="Times New Roman" w:eastAsia="Times New Roman" w:hAnsi="Times New Roman"/>
-          <w:b w:val="false"/>
-          <w:bCs w:val="false"/>
-          <w:i w:val="false"/>
-          <w:iCs w:val="false"/>
-          <w:sz w:val="28"/>
-          <w:szCs w:val="28"/>
+        <w:t xml:space="preserve"> (</w:t>
+      </w:r>
+      <w:r>
+        <w:rPr>
+          <w:rFonts w:ascii="Times New Roman" w:cs="Times New Roman" w:eastAsia="Times New Roman" w:hAnsi="Times New Roman"/>
+          <w:b w:val="false"/>
+          <w:bCs w:val="false"/>
+          <w:i w:val="false"/>
+          <w:iCs w:val="false"/>
+          <w:sz w:val="28"/>
+          <w:szCs w:val="28"/>
+          <w:u w:val="single"/>
+        </w:rPr>
+        <w:t xml:space="preserve">DRs</w:t>
+      </w:r>
+      <w:r>
+        <w:rPr>
+          <w:rFonts w:ascii="Times New Roman" w:cs="Times New Roman" w:eastAsia="Times New Roman" w:hAnsi="Times New Roman"/>
+          <w:b w:val="false"/>
+          <w:bCs w:val="false"/>
+          <w:i w:val="false"/>
+          <w:iCs w:val="false"/>
+          <w:sz w:val="28"/>
+          <w:szCs w:val="28"/>
+        </w:rPr>
+        <w:t xml:space="preserve">), which then serve as a basis for deriving the </w:t>
+      </w:r>
+      <w:r>
+        <w:rPr>
+          <w:rFonts w:ascii="Times New Roman" w:cs="Times New Roman" w:eastAsia="Times New Roman" w:hAnsi="Times New Roman"/>
+          <w:b w:val="false"/>
+          <w:bCs w:val="false"/>
+          <w:i w:val="false"/>
+          <w:iCs w:val="false"/>
+          <w:sz w:val="28"/>
+          <w:szCs w:val="28"/>
+          <w:u w:val="single"/>
         </w:rPr>
         <w:t xml:space="preserve">DPs</w:t>
       </w:r>

</xml_diff>